<commit_message>
docs: smoother Chinese wording; add mne-mcp-setup skill for one-shot install
- Replace awkward '万能逃生口/触达整个 MNE API/活动会话' with natural phrasing across zh docs (README.zh-CN, INTRODUCTION, USAGE) and regenerate the .docx.
- Add skills/mne-mcp-setup: a skill that drives the full install -> verify -> register -> install-skills flow via shell commands, with the explicit note that MCP tools require a client restart before they are callable (cannot install + call in one session).
- Mention the setup skill in README (en/zh) and INSTALL.

Co-Authored-By: Claude Opus 4.8 (1M context) <noreply@anthropic.com>
</commit_message>
<xml_diff>
--- a/docs/INSTALL.docx
+++ b/docs/INSTALL.docx
@@ -556,6 +556,107 @@
       </w:pPr>
       <w:r>
         <w:t xml:space="preserve">3. 安装步骤</w:t>
+      </w:r>
+    </w:p>
+    <w:p>
+      <w:pPr>
+        <w:pStyle w:val="BlockText"/>
+      </w:pPr>
+      <w:r>
+        <w:rPr>
+          <w:b/>
+          <w:bCs/>
+        </w:rPr>
+        <w:t xml:space="preserve">想让 Claude 帮你装？</w:t>
+      </w:r>
+      <w:r>
+        <w:t xml:space="preserve"> </w:t>
+      </w:r>
+      <w:r>
+        <w:t xml:space="preserve">仓库自带</w:t>
+      </w:r>
+      <w:r>
+        <w:t xml:space="preserve"> </w:t>
+      </w:r>
+      <w:r>
+        <w:rPr>
+          <w:rStyle w:val="VerbatimChar"/>
+        </w:rPr>
+        <w:t xml:space="preserve">skills/mne-mcp-setup</w:t>
+      </w:r>
+      <w:r>
+        <w:t xml:space="preserve"> </w:t>
+      </w:r>
+      <w:r>
+        <w:t xml:space="preserve">技能。把它复制到</w:t>
+      </w:r>
+      <w:r>
+        <w:t xml:space="preserve"> </w:t>
+      </w:r>
+      <w:r>
+        <w:rPr>
+          <w:rStyle w:val="VerbatimChar"/>
+        </w:rPr>
+        <w:t xml:space="preserve">~/.claude/skills/</w:t>
+      </w:r>
+      <w:r>
+        <w:t xml:space="preserve"> </w:t>
+      </w:r>
+      <w:r>
+        <w:t xml:space="preserve">并重启</w:t>
+      </w:r>
+      <w:r>
+        <w:t xml:space="preserve"> </w:t>
+      </w:r>
+      <w:r>
+        <w:t xml:space="preserve">Claude Code 后，对它说“帮我安装并配置 mne-mcp”，它会按下面的步骤逐条执行（建环境、安装、注册、装技能、</w:t>
+      </w:r>
+      <w:r>
+        <w:t xml:space="preserve"> </w:t>
+      </w:r>
+      <w:r>
+        <w:t xml:space="preserve">验证）。注意：MCP 服务器在客户端</w:t>
+      </w:r>
+      <w:r>
+        <w:rPr>
+          <w:b/>
+          <w:bCs/>
+        </w:rPr>
+        <w:t xml:space="preserve">启动时</w:t>
+      </w:r>
+      <w:r>
+        <w:t xml:space="preserve">加载，所以装完仍需</w:t>
+      </w:r>
+      <w:r>
+        <w:rPr>
+          <w:b/>
+          <w:bCs/>
+        </w:rPr>
+        <w:t xml:space="preserve">重启一次</w:t>
+      </w:r>
+      <w:r>
+        <w:t xml:space="preserve">才能调用</w:t>
+      </w:r>
+      <w:r>
+        <w:t xml:space="preserve"> </w:t>
+      </w:r>
+      <w:r>
+        <w:rPr>
+          <w:rStyle w:val="VerbatimChar"/>
+        </w:rPr>
+        <w:t xml:space="preserve">mne_*</w:t>
+      </w:r>
+      <w:r>
+        <w:t xml:space="preserve"> </w:t>
+      </w:r>
+      <w:r>
+        <w:t xml:space="preserve">工具——这一步</w:t>
+      </w:r>
+      <w:r>
+        <w:t xml:space="preserve"> </w:t>
+      </w:r>
+      <w:r>
+        <w:t xml:space="preserve">无法在同一个会话里跳过。下面是手动步骤。</w:t>
       </w:r>
     </w:p>
     <w:bookmarkStart w:id="28" w:name="获取代码"/>

</xml_diff>

<commit_message>
feat: one-shot install scripts (ps1/sh) + rewrite mne-mcp-setup skill
- Add scripts/install.ps1 and scripts/install.sh: idempotent one-command install (venv -> pip install [ica] -> verify -> configure-claude -> install skills), with -Mirror/-SkipClaude/-SkipSkills flags. Tested on Windows.
- Rewrite skills/mne-mcp-setup to drive the install script (fast path) with a manual fallback, troubleshooting table, and the explicit MCP-needs-restart note.
- Point README (en/zh) and INSTALL at the one-click scripts.

Co-Authored-By: Claude Opus 4.8 (1M context) <noreply@anthropic.com>
</commit_message>
<xml_diff>
--- a/docs/INSTALL.docx
+++ b/docs/INSTALL.docx
@@ -567,13 +567,97 @@
           <w:b/>
           <w:bCs/>
         </w:rPr>
-        <w:t xml:space="preserve">想让 Claude 帮你装？</w:t>
-      </w:r>
-      <w:r>
-        <w:t xml:space="preserve"> </w:t>
-      </w:r>
-      <w:r>
-        <w:t xml:space="preserve">仓库自带</w:t>
+        <w:t xml:space="preserve">最快：一键脚本。</w:t>
+      </w:r>
+      <w:r>
+        <w:t xml:space="preserve"> </w:t>
+      </w:r>
+      <w:r>
+        <w:t xml:space="preserve">克隆仓库后，在仓库目录运行一条命令即可完成全部安装（建环境、装依赖、验证、注册</w:t>
+      </w:r>
+      <w:r>
+        <w:t xml:space="preserve"> </w:t>
+      </w:r>
+      <w:r>
+        <w:t xml:space="preserve">Claude Code、装技能）：</w:t>
+      </w:r>
+    </w:p>
+    <w:p>
+      <w:pPr>
+        <w:pStyle w:val="SourceCode"/>
+      </w:pPr>
+      <w:r>
+        <w:rPr>
+          <w:rStyle w:val="NormalTok"/>
+        </w:rPr>
+        <w:t xml:space="preserve">pwsh </w:t>
+      </w:r>
+      <w:r>
+        <w:rPr>
+          <w:rStyle w:val="OperatorTok"/>
+        </w:rPr>
+        <w:t xml:space="preserve">-</w:t>
+      </w:r>
+      <w:r>
+        <w:rPr>
+          <w:rStyle w:val="NormalTok"/>
+        </w:rPr>
+        <w:t xml:space="preserve">File scripts\install</w:t>
+      </w:r>
+      <w:r>
+        <w:rPr>
+          <w:rStyle w:val="OperatorTok"/>
+        </w:rPr>
+        <w:t xml:space="preserve">.</w:t>
+      </w:r>
+      <w:r>
+        <w:rPr>
+          <w:rStyle w:val="FunctionTok"/>
+        </w:rPr>
+        <w:t xml:space="preserve">ps1</w:t>
+      </w:r>
+      <w:r>
+        <w:rPr>
+          <w:rStyle w:val="NormalTok"/>
+        </w:rPr>
+        <w:t xml:space="preserve">        </w:t>
+      </w:r>
+      <w:r>
+        <w:rPr>
+          <w:rStyle w:val="CommentTok"/>
+        </w:rPr>
+        <w:t xml:space="preserve"># Windows</w:t>
+      </w:r>
+    </w:p>
+    <w:p>
+      <w:pPr>
+        <w:pStyle w:val="SourceCode"/>
+      </w:pPr>
+      <w:r>
+        <w:rPr>
+          <w:rStyle w:val="FunctionTok"/>
+        </w:rPr>
+        <w:t xml:space="preserve">bash</w:t>
+      </w:r>
+      <w:r>
+        <w:rPr>
+          <w:rStyle w:val="NormalTok"/>
+        </w:rPr>
+        <w:t xml:space="preserve"> scripts/install.sh               </w:t>
+      </w:r>
+      <w:r>
+        <w:rPr>
+          <w:rStyle w:val="CommentTok"/>
+        </w:rPr>
+        <w:t xml:space="preserve"># macOS / Linux</w:t>
+      </w:r>
+    </w:p>
+    <w:p>
+      <w:pPr>
+        <w:pStyle w:val="BlockText"/>
+      </w:pPr>
+      <w:r>
+        <w:t xml:space="preserve">国内加速：PowerShell 加</w:t>
       </w:r>
       <w:r>
         <w:t xml:space="preserve"> </w:t>
@@ -582,13 +666,10 @@
         <w:rPr>
           <w:rStyle w:val="VerbatimChar"/>
         </w:rPr>
-        <w:t xml:space="preserve">skills/mne-mcp-setup</w:t>
-      </w:r>
-      <w:r>
-        <w:t xml:space="preserve"> </w:t>
-      </w:r>
-      <w:r>
-        <w:t xml:space="preserve">技能。把它复制到</w:t>
+        <w:t xml:space="preserve">-Mirror</w:t>
+      </w:r>
+      <w:r>
+        <w:t xml:space="preserve">，bash 用</w:t>
       </w:r>
       <w:r>
         <w:t xml:space="preserve"> </w:t>
@@ -597,48 +678,137 @@
         <w:rPr>
           <w:rStyle w:val="VerbatimChar"/>
         </w:rPr>
-        <w:t xml:space="preserve">~/.claude/skills/</w:t>
-      </w:r>
-      <w:r>
-        <w:t xml:space="preserve"> </w:t>
-      </w:r>
-      <w:r>
-        <w:t xml:space="preserve">并重启</w:t>
-      </w:r>
-      <w:r>
-        <w:t xml:space="preserve"> </w:t>
-      </w:r>
-      <w:r>
-        <w:t xml:space="preserve">Claude Code 后，对它说“帮我安装并配置 mne-mcp”，它会按下面的步骤逐条执行（建环境、安装、注册、装技能、</w:t>
-      </w:r>
-      <w:r>
-        <w:t xml:space="preserve"> </w:t>
-      </w:r>
-      <w:r>
-        <w:t xml:space="preserve">验证）。注意：MCP 服务器在客户端</w:t>
+        <w:t xml:space="preserve">MIRROR=1 bash scripts/install.sh</w:t>
+      </w:r>
+      <w:r>
+        <w:t xml:space="preserve">。脚本</w:t>
       </w:r>
       <w:r>
         <w:rPr>
           <w:b/>
           <w:bCs/>
         </w:rPr>
-        <w:t xml:space="preserve">启动时</w:t>
-      </w:r>
-      <w:r>
-        <w:t xml:space="preserve">加载，所以装完仍需</w:t>
-      </w:r>
+        <w:t xml:space="preserve">幂等</w:t>
+      </w:r>
+      <w:r>
+        <w:t xml:space="preserve">，可重复运行；</w:t>
+      </w:r>
+      <w:r>
+        <w:t xml:space="preserve"> </w:t>
+      </w:r>
+      <w:r>
+        <w:t xml:space="preserve">加</w:t>
+      </w:r>
+      <w:r>
+        <w:t xml:space="preserve"> </w:t>
+      </w:r>
+      <w:r>
+        <w:rPr>
+          <w:rStyle w:val="VerbatimChar"/>
+        </w:rPr>
+        <w:t xml:space="preserve">-SkipClaude</w:t>
+      </w:r>
+      <w:r>
+        <w:t xml:space="preserve"> </w:t>
+      </w:r>
+      <w:r>
+        <w:t xml:space="preserve">/</w:t>
+      </w:r>
+      <w:r>
+        <w:t xml:space="preserve"> </w:t>
+      </w:r>
+      <w:r>
+        <w:rPr>
+          <w:rStyle w:val="VerbatimChar"/>
+        </w:rPr>
+        <w:t xml:space="preserve">SKIP_CLAUDE=1</w:t>
+      </w:r>
+      <w:r>
+        <w:t xml:space="preserve"> </w:t>
+      </w:r>
+      <w:r>
+        <w:t xml:space="preserve">可只装不改</w:t>
+      </w:r>
+      <w:r>
+        <w:t xml:space="preserve"> </w:t>
+      </w:r>
+      <w:r>
+        <w:rPr>
+          <w:rStyle w:val="VerbatimChar"/>
+        </w:rPr>
+        <w:t xml:space="preserve">~/.claude.json</w:t>
+      </w:r>
+      <w:r>
+        <w:t xml:space="preserve">。</w:t>
+      </w:r>
+    </w:p>
+    <w:p>
+      <w:pPr>
+        <w:pStyle w:val="BlockText"/>
+      </w:pPr>
       <w:r>
         <w:rPr>
           <w:b/>
           <w:bCs/>
         </w:rPr>
+        <w:t xml:space="preserve">或让 Claude 代劳</w:t>
+      </w:r>
+      <w:r>
+        <w:t xml:space="preserve">：把</w:t>
+      </w:r>
+      <w:r>
+        <w:t xml:space="preserve"> </w:t>
+      </w:r>
+      <w:r>
+        <w:rPr>
+          <w:rStyle w:val="VerbatimChar"/>
+        </w:rPr>
+        <w:t xml:space="preserve">skills/mne-mcp-setup</w:t>
+      </w:r>
+      <w:r>
+        <w:t xml:space="preserve"> </w:t>
+      </w:r>
+      <w:r>
+        <w:t xml:space="preserve">复制到</w:t>
+      </w:r>
+      <w:r>
+        <w:t xml:space="preserve"> </w:t>
+      </w:r>
+      <w:r>
+        <w:rPr>
+          <w:rStyle w:val="VerbatimChar"/>
+        </w:rPr>
+        <w:t xml:space="preserve">~/.claude/skills/</w:t>
+      </w:r>
+      <w:r>
+        <w:t xml:space="preserve">、重启后对它说“帮我安装并配置</w:t>
+      </w:r>
+      <w:r>
+        <w:t xml:space="preserve"> </w:t>
+      </w:r>
+      <w:r>
+        <w:t xml:space="preserve">mne-mcp”，它会调用上面的脚本完成。</w:t>
+      </w:r>
+    </w:p>
+    <w:p>
+      <w:pPr>
+        <w:pStyle w:val="BlockText"/>
+      </w:pPr>
+      <w:r>
+        <w:t xml:space="preserve">两种方式装完都需</w:t>
+      </w:r>
+      <w:r>
+        <w:rPr>
+          <w:b/>
+          <w:bCs/>
+        </w:rPr>
         <w:t xml:space="preserve">重启一次</w:t>
       </w:r>
       <w:r>
-        <w:t xml:space="preserve">才能调用</w:t>
-      </w:r>
-      <w:r>
-        <w:t xml:space="preserve"> </w:t>
+        <w:t xml:space="preserve"> </w:t>
+      </w:r>
+      <w:r>
+        <w:t xml:space="preserve">Claude Code，</w:t>
       </w:r>
       <w:r>
         <w:rPr>
@@ -650,13 +820,13 @@
         <w:t xml:space="preserve"> </w:t>
       </w:r>
       <w:r>
-        <w:t xml:space="preserve">工具——这一步</w:t>
-      </w:r>
-      <w:r>
-        <w:t xml:space="preserve"> </w:t>
-      </w:r>
-      <w:r>
-        <w:t xml:space="preserve">无法在同一个会话里跳过。下面是手动步骤。</w:t>
+        <w:t xml:space="preserve">工具才会加载（MCP 在客户端启动时加载，无法在同一会话内</w:t>
+      </w:r>
+      <w:r>
+        <w:t xml:space="preserve"> </w:t>
+      </w:r>
+      <w:r>
+        <w:t xml:space="preserve">省略这一步）。下面是逐步手动安装。</w:t>
       </w:r>
     </w:p>
     <w:bookmarkStart w:id="28" w:name="获取代码"/>

</xml_diff>